<commit_message>
1. Initial setup update
</commit_message>
<xml_diff>
--- a/Prerequisites/Instructions_Setup.docx
+++ b/Prerequisites/Instructions_Setup.docx
@@ -22,6 +22,53 @@
         </w:rPr>
         <w:t>Installing Miniconda</w:t>
       </w:r>
+    </w:p>
+    <w:p>
+      <w:pPr>
+        <w:pStyle w:val="Heading3"/>
+        <w:jc w:val="both"/>
+        <w:rPr>
+          <w:sz w:val="22"/>
+          <w:szCs w:val="22"/>
+          <w:lang w:val="en-US" w:eastAsia="es-ES"/>
+        </w:rPr>
+      </w:pPr>
+      <w:r>
+        <w:rPr>
+          <w:b/>
+          <w:bCs/>
+          <w:color w:val="C00000"/>
+          <w:sz w:val="22"/>
+          <w:szCs w:val="22"/>
+          <w:lang w:val="en-US" w:eastAsia="es-ES"/>
+        </w:rPr>
+        <w:t>VERY IMPORTANT!</w:t>
+      </w:r>
+      <w:r>
+        <w:rPr>
+          <w:sz w:val="22"/>
+          <w:szCs w:val="22"/>
+          <w:lang w:val="en-US" w:eastAsia="es-ES"/>
+        </w:rPr>
+        <w:t xml:space="preserve"> </w:t>
+      </w:r>
+      <w:r>
+        <w:rPr>
+          <w:sz w:val="22"/>
+          <w:szCs w:val="22"/>
+          <w:lang w:eastAsia="es-ES"/>
+        </w:rPr>
+        <w:t>If you already have Anaconda or Miniconda installed, skip this section and go directly to Section 2.</w:t>
+      </w:r>
+    </w:p>
+    <w:p>
+      <w:pPr>
+        <w:pStyle w:val="Heading3"/>
+        <w:jc w:val="both"/>
+        <w:rPr>
+          <w:lang w:val="en-US" w:eastAsia="es-ES"/>
+        </w:rPr>
+      </w:pPr>
     </w:p>
     <w:p>
       <w:pPr>
@@ -225,12 +272,14 @@
           <w:lang w:val="en-US" w:eastAsia="es-ES"/>
         </w:rPr>
       </w:pPr>
+      <w:proofErr w:type="spellStart"/>
       <w:r>
         <w:rPr>
           <w:lang w:val="en-US" w:eastAsia="es-ES"/>
         </w:rPr>
         <w:t>MacOs</w:t>
       </w:r>
+      <w:proofErr w:type="spellEnd"/>
     </w:p>
     <w:p>
       <w:pPr>
@@ -470,6 +519,7 @@
           <w:noProof/>
           <w:lang w:val="en-US"/>
         </w:rPr>
+        <w:lastRenderedPageBreak/>
         <w:drawing>
           <wp:inline distT="0" distB="0" distL="0" distR="0" wp14:anchorId="477E09D1" wp14:editId="09A4A490">
             <wp:extent cx="5292090" cy="822960"/>
@@ -528,7 +578,6 @@
         <w:rPr>
           <w:lang w:val="en-US" w:eastAsia="es-ES"/>
         </w:rPr>
-        <w:lastRenderedPageBreak/>
         <w:t>Follow the instructions for “</w:t>
       </w:r>
       <w:r>
@@ -634,7 +683,21 @@
         <w:rPr>
           <w:lang w:val="en-US"/>
         </w:rPr>
-        <w:t>” and select your OS in the “Quickstart install instructions” tab:</w:t>
+        <w:t>” and select your OS in the “</w:t>
+      </w:r>
+      <w:proofErr w:type="spellStart"/>
+      <w:r>
+        <w:rPr>
+          <w:lang w:val="en-US"/>
+        </w:rPr>
+        <w:t>Quickstart</w:t>
+      </w:r>
+      <w:proofErr w:type="spellEnd"/>
+      <w:r>
+        <w:rPr>
+          <w:lang w:val="en-US"/>
+        </w:rPr>
+        <w:t xml:space="preserve"> install instructions” tab:</w:t>
       </w:r>
     </w:p>
     <w:p>
@@ -874,7 +937,31 @@
           <w:lang w:val="en-US" w:eastAsia="es-ES"/>
           <w14:ligatures w14:val="none"/>
         </w:rPr>
-        <w:t>Invoke-WebRequest : Access to the path 'C:\windows\system32\Miniconda3-latest-Windows-x86_64.exe' is denied.</w:t>
+        <w:t>Invoke-</w:t>
+      </w:r>
+      <w:proofErr w:type="spellStart"/>
+      <w:r>
+        <w:rPr>
+          <w:rFonts w:eastAsia="Times New Roman" w:cs="Courier New"/>
+          <w:kern w:val="0"/>
+          <w:sz w:val="24"/>
+          <w:szCs w:val="24"/>
+          <w:lang w:val="en-US" w:eastAsia="es-ES"/>
+          <w14:ligatures w14:val="none"/>
+        </w:rPr>
+        <w:t>WebRequest</w:t>
+      </w:r>
+      <w:proofErr w:type="spellEnd"/>
+      <w:r>
+        <w:rPr>
+          <w:rFonts w:eastAsia="Times New Roman" w:cs="Courier New"/>
+          <w:kern w:val="0"/>
+          <w:sz w:val="24"/>
+          <w:szCs w:val="24"/>
+          <w:lang w:val="en-US" w:eastAsia="es-ES"/>
+          <w14:ligatures w14:val="none"/>
+        </w:rPr>
+        <w:t xml:space="preserve"> : Access to the path 'C:\windows\system32\Miniconda3-latest-Windows-x86_64.exe' is denied.</w:t>
       </w:r>
     </w:p>
     <w:p>
@@ -930,7 +1017,55 @@
           <w:lang w:val="en-US" w:eastAsia="es-ES"/>
           <w14:ligatures w14:val="none"/>
         </w:rPr>
-        <w:t>+ Invoke-WebRequest -Uri "https://repo.anaconda.com/miniconda/Miniconda ...</w:t>
+        <w:t>+ Invoke-</w:t>
+      </w:r>
+      <w:proofErr w:type="spellStart"/>
+      <w:r>
+        <w:rPr>
+          <w:rFonts w:eastAsia="Times New Roman" w:cs="Courier New"/>
+          <w:kern w:val="0"/>
+          <w:sz w:val="24"/>
+          <w:szCs w:val="24"/>
+          <w:lang w:val="en-US" w:eastAsia="es-ES"/>
+          <w14:ligatures w14:val="none"/>
+        </w:rPr>
+        <w:t>WebRequest</w:t>
+      </w:r>
+      <w:proofErr w:type="spellEnd"/>
+      <w:r>
+        <w:rPr>
+          <w:rFonts w:eastAsia="Times New Roman" w:cs="Courier New"/>
+          <w:kern w:val="0"/>
+          <w:sz w:val="24"/>
+          <w:szCs w:val="24"/>
+          <w:lang w:val="en-US" w:eastAsia="es-ES"/>
+          <w14:ligatures w14:val="none"/>
+        </w:rPr>
+        <w:t xml:space="preserve"> -Uri "https://repo.anaconda.com/</w:t>
+      </w:r>
+      <w:proofErr w:type="spellStart"/>
+      <w:r>
+        <w:rPr>
+          <w:rFonts w:eastAsia="Times New Roman" w:cs="Courier New"/>
+          <w:kern w:val="0"/>
+          <w:sz w:val="24"/>
+          <w:szCs w:val="24"/>
+          <w:lang w:val="en-US" w:eastAsia="es-ES"/>
+          <w14:ligatures w14:val="none"/>
+        </w:rPr>
+        <w:t>miniconda</w:t>
+      </w:r>
+      <w:proofErr w:type="spellEnd"/>
+      <w:r>
+        <w:rPr>
+          <w:rFonts w:eastAsia="Times New Roman" w:cs="Courier New"/>
+          <w:kern w:val="0"/>
+          <w:sz w:val="24"/>
+          <w:szCs w:val="24"/>
+          <w:lang w:val="en-US" w:eastAsia="es-ES"/>
+          <w14:ligatures w14:val="none"/>
+        </w:rPr>
+        <w:t>/Miniconda ...</w:t>
       </w:r>
     </w:p>
     <w:p>
@@ -958,6 +1093,7 @@
           <w:lang w:val="en-US" w:eastAsia="es-ES"/>
           <w14:ligatures w14:val="none"/>
         </w:rPr>
+        <w:lastRenderedPageBreak/>
         <w:t>+ ~~~~~~~~~~~~~~~~~~~~~~~~~~~~~~~~~~~~~~~~~~~~~~~~~~~~~~~~~~~~~~~~~~~~~</w:t>
       </w:r>
     </w:p>
@@ -986,8 +1122,69 @@
           <w:lang w:val="en-US" w:eastAsia="es-ES"/>
           <w14:ligatures w14:val="none"/>
         </w:rPr>
-        <w:t xml:space="preserve">    + CategoryInfo          : NotSpecified: (:) [Invoke-WebRequest], UnauthorizedAccessException</w:t>
-      </w:r>
+        <w:t xml:space="preserve">    + CategoryInfo          : </w:t>
+      </w:r>
+      <w:proofErr w:type="spellStart"/>
+      <w:r>
+        <w:rPr>
+          <w:rFonts w:eastAsia="Times New Roman" w:cs="Courier New"/>
+          <w:kern w:val="0"/>
+          <w:sz w:val="24"/>
+          <w:szCs w:val="24"/>
+          <w:lang w:val="en-US" w:eastAsia="es-ES"/>
+          <w14:ligatures w14:val="none"/>
+        </w:rPr>
+        <w:t>NotSpecified</w:t>
+      </w:r>
+      <w:proofErr w:type="spellEnd"/>
+      <w:r>
+        <w:rPr>
+          <w:rFonts w:eastAsia="Times New Roman" w:cs="Courier New"/>
+          <w:kern w:val="0"/>
+          <w:sz w:val="24"/>
+          <w:szCs w:val="24"/>
+          <w:lang w:val="en-US" w:eastAsia="es-ES"/>
+          <w14:ligatures w14:val="none"/>
+        </w:rPr>
+        <w:t>: (:) [Invoke-</w:t>
+      </w:r>
+      <w:proofErr w:type="spellStart"/>
+      <w:r>
+        <w:rPr>
+          <w:rFonts w:eastAsia="Times New Roman" w:cs="Courier New"/>
+          <w:kern w:val="0"/>
+          <w:sz w:val="24"/>
+          <w:szCs w:val="24"/>
+          <w:lang w:val="en-US" w:eastAsia="es-ES"/>
+          <w14:ligatures w14:val="none"/>
+        </w:rPr>
+        <w:t>WebRequest</w:t>
+      </w:r>
+      <w:proofErr w:type="spellEnd"/>
+      <w:r>
+        <w:rPr>
+          <w:rFonts w:eastAsia="Times New Roman" w:cs="Courier New"/>
+          <w:kern w:val="0"/>
+          <w:sz w:val="24"/>
+          <w:szCs w:val="24"/>
+          <w:lang w:val="en-US" w:eastAsia="es-ES"/>
+          <w14:ligatures w14:val="none"/>
+        </w:rPr>
+        <w:t xml:space="preserve">], </w:t>
+      </w:r>
+      <w:proofErr w:type="spellStart"/>
+      <w:r>
+        <w:rPr>
+          <w:rFonts w:eastAsia="Times New Roman" w:cs="Courier New"/>
+          <w:kern w:val="0"/>
+          <w:sz w:val="24"/>
+          <w:szCs w:val="24"/>
+          <w:lang w:val="en-US" w:eastAsia="es-ES"/>
+          <w14:ligatures w14:val="none"/>
+        </w:rPr>
+        <w:t>UnauthorizedAccessException</w:t>
+      </w:r>
+      <w:proofErr w:type="spellEnd"/>
     </w:p>
     <w:p>
       <w:pPr>
@@ -1015,8 +1212,31 @@
           <w:lang w:val="en-US" w:eastAsia="es-ES"/>
           <w14:ligatures w14:val="none"/>
         </w:rPr>
-        <w:lastRenderedPageBreak/>
-        <w:t xml:space="preserve">    + FullyQualifiedErrorId : System.UnauthorizedAccessException,Microsoft.PowerShell.Commands.InvokeWebRequestCommand</w:t>
+        <w:t xml:space="preserve">    + </w:t>
+      </w:r>
+      <w:proofErr w:type="spellStart"/>
+      <w:r>
+        <w:rPr>
+          <w:rFonts w:eastAsia="Times New Roman" w:cs="Courier New"/>
+          <w:kern w:val="0"/>
+          <w:sz w:val="24"/>
+          <w:szCs w:val="24"/>
+          <w:lang w:val="en-US" w:eastAsia="es-ES"/>
+          <w14:ligatures w14:val="none"/>
+        </w:rPr>
+        <w:t>FullyQualifiedErrorId</w:t>
+      </w:r>
+      <w:proofErr w:type="spellEnd"/>
+      <w:r>
+        <w:rPr>
+          <w:rFonts w:eastAsia="Times New Roman" w:cs="Courier New"/>
+          <w:kern w:val="0"/>
+          <w:sz w:val="24"/>
+          <w:szCs w:val="24"/>
+          <w:lang w:val="en-US" w:eastAsia="es-ES"/>
+          <w14:ligatures w14:val="none"/>
+        </w:rPr>
+        <w:t xml:space="preserve"> : System.UnauthorizedAccessException,Microsoft.PowerShell.Commands.InvokeWebRequestCommand</w:t>
       </w:r>
     </w:p>
     <w:p>
@@ -1098,7 +1318,31 @@
           <w:lang w:val="en-US" w:eastAsia="es-ES"/>
           <w14:ligatures w14:val="none"/>
         </w:rPr>
-        <w:t>and then try again with the commands suggested in the miniconda webpage</w:t>
+        <w:t xml:space="preserve">and then try again with the commands suggested in the </w:t>
+      </w:r>
+      <w:proofErr w:type="spellStart"/>
+      <w:r>
+        <w:rPr>
+          <w:rFonts w:eastAsia="Times New Roman" w:cs="Courier New"/>
+          <w:kern w:val="0"/>
+          <w:sz w:val="24"/>
+          <w:szCs w:val="24"/>
+          <w:lang w:val="en-US" w:eastAsia="es-ES"/>
+          <w14:ligatures w14:val="none"/>
+        </w:rPr>
+        <w:t>miniconda</w:t>
+      </w:r>
+      <w:proofErr w:type="spellEnd"/>
+      <w:r>
+        <w:rPr>
+          <w:rFonts w:eastAsia="Times New Roman" w:cs="Courier New"/>
+          <w:kern w:val="0"/>
+          <w:sz w:val="24"/>
+          <w:szCs w:val="24"/>
+          <w:lang w:val="en-US" w:eastAsia="es-ES"/>
+          <w14:ligatures w14:val="none"/>
+        </w:rPr>
+        <w:t xml:space="preserve"> webpage</w:t>
       </w:r>
       <w:r>
         <w:rPr>
@@ -1575,12 +1819,14 @@
         </w:rPr>
         <w:t>“</w:t>
       </w:r>
+      <w:proofErr w:type="spellStart"/>
       <w:r>
         <w:rPr>
           <w:lang w:val="en-US"/>
         </w:rPr>
         <w:t>ML_course</w:t>
       </w:r>
+      <w:proofErr w:type="spellEnd"/>
       <w:r>
         <w:rPr>
           <w:lang w:val="en-US"/>
@@ -1751,8 +1997,18 @@
           <w:szCs w:val="24"/>
           <w:lang w:val="en-US"/>
         </w:rPr>
-        <w:t>Users/Folder_1/Folder_2/Folder_3/…/ML_course</w:t>
-      </w:r>
+        <w:t>Users/Folder_1/Folder_2/Folder_3/…/</w:t>
+      </w:r>
+      <w:proofErr w:type="spellStart"/>
+      <w:r>
+        <w:rPr>
+          <w:sz w:val="24"/>
+          <w:szCs w:val="24"/>
+          <w:lang w:val="en-US"/>
+        </w:rPr>
+        <w:t>ML_course</w:t>
+      </w:r>
+      <w:proofErr w:type="spellEnd"/>
       <w:r>
         <w:rPr>
           <w:sz w:val="24"/>
@@ -1786,6 +2042,7 @@
           <w:szCs w:val="24"/>
           <w:lang w:val="en-US"/>
         </w:rPr>
+        <w:lastRenderedPageBreak/>
         <w:t>VERY IMPORTANT 3!</w:t>
       </w:r>
       <w:r>
@@ -1866,7 +2123,6 @@
           <w:szCs w:val="24"/>
           <w:u w:val="single"/>
         </w:rPr>
-        <w:lastRenderedPageBreak/>
         <w:t>Good:</w:t>
       </w:r>
       <w:r>
@@ -2192,7 +2448,35 @@
         <w:rPr>
           <w:lang w:val="en-US"/>
         </w:rPr>
-        <w:t>.2. Create New Conda Environments (named cheminf &amp; almos)</w:t>
+        <w:t xml:space="preserve">.2. Create New Conda Environments (named </w:t>
+      </w:r>
+      <w:proofErr w:type="spellStart"/>
+      <w:r>
+        <w:rPr>
+          <w:lang w:val="en-US"/>
+        </w:rPr>
+        <w:t>cheminf</w:t>
+      </w:r>
+      <w:proofErr w:type="spellEnd"/>
+      <w:r>
+        <w:rPr>
+          <w:lang w:val="en-US"/>
+        </w:rPr>
+        <w:t xml:space="preserve"> &amp; </w:t>
+      </w:r>
+      <w:proofErr w:type="spellStart"/>
+      <w:r>
+        <w:rPr>
+          <w:lang w:val="en-US"/>
+        </w:rPr>
+        <w:t>almos</w:t>
+      </w:r>
+      <w:proofErr w:type="spellEnd"/>
+      <w:r>
+        <w:rPr>
+          <w:lang w:val="en-US"/>
+        </w:rPr>
+        <w:t>)</w:t>
       </w:r>
     </w:p>
     <w:p>
@@ -2221,12 +2505,14 @@
         </w:rPr>
         <w:t>Go to the “</w:t>
       </w:r>
+      <w:proofErr w:type="spellStart"/>
       <w:r>
         <w:rPr>
           <w:lang w:val="en-US"/>
         </w:rPr>
         <w:t>ML_course</w:t>
       </w:r>
+      <w:proofErr w:type="spellEnd"/>
       <w:r>
         <w:rPr>
           <w:lang w:val="en-US"/>
@@ -2245,12 +2531,14 @@
         </w:rPr>
         <w:t>/</w:t>
       </w:r>
+      <w:proofErr w:type="spellStart"/>
       <w:r>
         <w:rPr>
           <w:lang w:val="en-US"/>
         </w:rPr>
         <w:t>Setup_and_testing</w:t>
       </w:r>
+      <w:proofErr w:type="spellEnd"/>
       <w:r>
         <w:rPr>
           <w:lang w:val="en-US"/>
@@ -2275,12 +2563,14 @@
         </w:rPr>
         <w:t>“</w:t>
       </w:r>
+      <w:proofErr w:type="spellStart"/>
       <w:r>
         <w:rPr>
           <w:lang w:val="en-US"/>
         </w:rPr>
         <w:t>ML_course</w:t>
       </w:r>
+      <w:proofErr w:type="spellEnd"/>
       <w:r>
         <w:rPr>
           <w:lang w:val="en-US"/>
@@ -2299,12 +2589,14 @@
         </w:rPr>
         <w:t>/</w:t>
       </w:r>
+      <w:proofErr w:type="spellStart"/>
       <w:r>
         <w:rPr>
           <w:lang w:val="en-US"/>
         </w:rPr>
         <w:t>Setup_and_testing</w:t>
       </w:r>
+      <w:proofErr w:type="spellEnd"/>
       <w:r>
         <w:rPr>
           <w:lang w:val="en-US"/>
@@ -2498,7 +2790,25 @@
           <w:szCs w:val="24"/>
           <w:lang w:val="en-US"/>
         </w:rPr>
-        <w:t>terminal should be in the “Setup_and_testing” folder. Y</w:t>
+        <w:t>terminal should be in the “</w:t>
+      </w:r>
+      <w:proofErr w:type="spellStart"/>
+      <w:r>
+        <w:rPr>
+          <w:sz w:val="24"/>
+          <w:szCs w:val="24"/>
+          <w:lang w:val="en-US"/>
+        </w:rPr>
+        <w:t>Setup_and_testing</w:t>
+      </w:r>
+      <w:proofErr w:type="spellEnd"/>
+      <w:r>
+        <w:rPr>
+          <w:sz w:val="24"/>
+          <w:szCs w:val="24"/>
+          <w:lang w:val="en-US"/>
+        </w:rPr>
+        <w:t>” folder. Y</w:t>
       </w:r>
       <w:r>
         <w:rPr>
@@ -2569,6 +2879,7 @@
           <w:noProof/>
           <w:lang w:val="en-US"/>
         </w:rPr>
+        <w:lastRenderedPageBreak/>
         <w:drawing>
           <wp:inline distT="0" distB="0" distL="0" distR="0" wp14:anchorId="5710A18C" wp14:editId="0BD45188">
             <wp:extent cx="3330123" cy="1078057"/>
@@ -2653,7 +2964,61 @@
           <w:szCs w:val="24"/>
           <w:lang w:val="en-US"/>
         </w:rPr>
-        <w:t>Make sure that you don’t have any previous environments with the same names as those to install (i.e., cheminf, baybe, chemtorch, etc.). For this, execute:</w:t>
+        <w:t xml:space="preserve">Make sure that you don’t have any previous environments with the same names as those to install (i.e., </w:t>
+      </w:r>
+      <w:proofErr w:type="spellStart"/>
+      <w:r>
+        <w:rPr>
+          <w:sz w:val="24"/>
+          <w:szCs w:val="24"/>
+          <w:lang w:val="en-US"/>
+        </w:rPr>
+        <w:t>cheminf</w:t>
+      </w:r>
+      <w:proofErr w:type="spellEnd"/>
+      <w:r>
+        <w:rPr>
+          <w:sz w:val="24"/>
+          <w:szCs w:val="24"/>
+          <w:lang w:val="en-US"/>
+        </w:rPr>
+        <w:t xml:space="preserve">, </w:t>
+      </w:r>
+      <w:proofErr w:type="spellStart"/>
+      <w:r>
+        <w:rPr>
+          <w:sz w:val="24"/>
+          <w:szCs w:val="24"/>
+          <w:lang w:val="en-US"/>
+        </w:rPr>
+        <w:t>baybe</w:t>
+      </w:r>
+      <w:proofErr w:type="spellEnd"/>
+      <w:r>
+        <w:rPr>
+          <w:sz w:val="24"/>
+          <w:szCs w:val="24"/>
+          <w:lang w:val="en-US"/>
+        </w:rPr>
+        <w:t xml:space="preserve">, </w:t>
+      </w:r>
+      <w:proofErr w:type="spellStart"/>
+      <w:r>
+        <w:rPr>
+          <w:sz w:val="24"/>
+          <w:szCs w:val="24"/>
+          <w:lang w:val="en-US"/>
+        </w:rPr>
+        <w:t>chemtorch</w:t>
+      </w:r>
+      <w:proofErr w:type="spellEnd"/>
+      <w:r>
+        <w:rPr>
+          <w:sz w:val="24"/>
+          <w:szCs w:val="24"/>
+          <w:lang w:val="en-US"/>
+        </w:rPr>
+        <w:t>, etc.). For this, execute:</w:t>
       </w:r>
     </w:p>
     <w:p>
@@ -2666,13 +3031,23 @@
           <w:lang w:val="en-US"/>
         </w:rPr>
       </w:pPr>
-      <w:r>
-        <w:rPr>
-          <w:sz w:val="24"/>
-          <w:szCs w:val="24"/>
-          <w:lang w:val="en-US"/>
-        </w:rPr>
-        <w:t>conda env list</w:t>
+      <w:proofErr w:type="spellStart"/>
+      <w:r>
+        <w:rPr>
+          <w:sz w:val="24"/>
+          <w:szCs w:val="24"/>
+          <w:lang w:val="en-US"/>
+        </w:rPr>
+        <w:t>conda</w:t>
+      </w:r>
+      <w:proofErr w:type="spellEnd"/>
+      <w:r>
+        <w:rPr>
+          <w:sz w:val="24"/>
+          <w:szCs w:val="24"/>
+          <w:lang w:val="en-US"/>
+        </w:rPr>
+        <w:t xml:space="preserve"> env list</w:t>
       </w:r>
     </w:p>
     <w:p>
@@ -2787,13 +3162,23 @@
           <w:lang w:val="en-GB"/>
         </w:rPr>
       </w:pPr>
+      <w:proofErr w:type="spellStart"/>
       <w:r>
         <w:rPr>
           <w:sz w:val="24"/>
           <w:szCs w:val="24"/>
           <w:lang w:val="en-GB"/>
         </w:rPr>
-        <w:t xml:space="preserve">conda env remove -y -n </w:t>
+        <w:t>conda</w:t>
+      </w:r>
+      <w:proofErr w:type="spellEnd"/>
+      <w:r>
+        <w:rPr>
+          <w:sz w:val="24"/>
+          <w:szCs w:val="24"/>
+          <w:lang w:val="en-GB"/>
+        </w:rPr>
+        <w:t xml:space="preserve"> env remove -y -n </w:t>
       </w:r>
       <w:r>
         <w:rPr>
@@ -2844,7 +3229,25 @@
           <w:szCs w:val="24"/>
           <w:lang w:val="en-GB"/>
         </w:rPr>
-        <w:t>or the name of the environment to remove, for example, the following command removes the cheminf environment:</w:t>
+        <w:t xml:space="preserve">or the name of the environment to remove, for example, the following command removes the </w:t>
+      </w:r>
+      <w:proofErr w:type="spellStart"/>
+      <w:r>
+        <w:rPr>
+          <w:sz w:val="24"/>
+          <w:szCs w:val="24"/>
+          <w:lang w:val="en-GB"/>
+        </w:rPr>
+        <w:t>cheminf</w:t>
+      </w:r>
+      <w:proofErr w:type="spellEnd"/>
+      <w:r>
+        <w:rPr>
+          <w:sz w:val="24"/>
+          <w:szCs w:val="24"/>
+          <w:lang w:val="en-GB"/>
+        </w:rPr>
+        <w:t xml:space="preserve"> environment:</w:t>
       </w:r>
     </w:p>
     <w:p>
@@ -2857,21 +3260,77 @@
           <w:lang w:val="es-ES"/>
         </w:rPr>
       </w:pPr>
+      <w:proofErr w:type="spellStart"/>
       <w:r>
         <w:rPr>
           <w:sz w:val="24"/>
           <w:szCs w:val="24"/>
           <w:lang w:val="es-ES"/>
         </w:rPr>
-        <w:t>conda env remove -y -n cheminf</w:t>
-      </w:r>
-    </w:p>
-    <w:p>
-      <w:pPr>
-        <w:jc w:val="both"/>
-        <w:rPr>
+        <w:t>conda</w:t>
+      </w:r>
+      <w:proofErr w:type="spellEnd"/>
+      <w:r>
+        <w:rPr>
+          <w:sz w:val="24"/>
+          <w:szCs w:val="24"/>
           <w:lang w:val="es-ES"/>
         </w:rPr>
+        <w:t xml:space="preserve"> </w:t>
+      </w:r>
+      <w:proofErr w:type="spellStart"/>
+      <w:r>
+        <w:rPr>
+          <w:sz w:val="24"/>
+          <w:szCs w:val="24"/>
+          <w:lang w:val="es-ES"/>
+        </w:rPr>
+        <w:t>env</w:t>
+      </w:r>
+      <w:proofErr w:type="spellEnd"/>
+      <w:r>
+        <w:rPr>
+          <w:sz w:val="24"/>
+          <w:szCs w:val="24"/>
+          <w:lang w:val="es-ES"/>
+        </w:rPr>
+        <w:t xml:space="preserve"> </w:t>
+      </w:r>
+      <w:proofErr w:type="spellStart"/>
+      <w:r>
+        <w:rPr>
+          <w:sz w:val="24"/>
+          <w:szCs w:val="24"/>
+          <w:lang w:val="es-ES"/>
+        </w:rPr>
+        <w:t>remove</w:t>
+      </w:r>
+      <w:proofErr w:type="spellEnd"/>
+      <w:r>
+        <w:rPr>
+          <w:sz w:val="24"/>
+          <w:szCs w:val="24"/>
+          <w:lang w:val="es-ES"/>
+        </w:rPr>
+        <w:t xml:space="preserve"> -y -n </w:t>
+      </w:r>
+      <w:proofErr w:type="spellStart"/>
+      <w:r>
+        <w:rPr>
+          <w:sz w:val="24"/>
+          <w:szCs w:val="24"/>
+          <w:lang w:val="es-ES"/>
+        </w:rPr>
+        <w:t>cheminf</w:t>
+      </w:r>
+      <w:proofErr w:type="spellEnd"/>
+    </w:p>
+    <w:p>
+      <w:pPr>
+        <w:jc w:val="both"/>
+        <w:rPr>
+          <w:lang w:val="es-ES"/>
+        </w:rPr>
       </w:pPr>
     </w:p>
     <w:p>
@@ -2939,12 +3398,28 @@
           <w:lang w:val="en-US"/>
         </w:rPr>
       </w:pPr>
-      <w:r>
-        <w:rPr>
-          <w:lang w:val="en-US"/>
-        </w:rPr>
-        <w:t>conda env create -f cheminf.yaml</w:t>
-      </w:r>
+      <w:proofErr w:type="spellStart"/>
+      <w:r>
+        <w:rPr>
+          <w:lang w:val="en-US"/>
+        </w:rPr>
+        <w:t>conda</w:t>
+      </w:r>
+      <w:proofErr w:type="spellEnd"/>
+      <w:r>
+        <w:rPr>
+          <w:lang w:val="en-US"/>
+        </w:rPr>
+        <w:t xml:space="preserve"> env create -f </w:t>
+      </w:r>
+      <w:proofErr w:type="spellStart"/>
+      <w:r>
+        <w:rPr>
+          <w:lang w:val="en-US"/>
+        </w:rPr>
+        <w:t>cheminf.yaml</w:t>
+      </w:r>
+      <w:proofErr w:type="spellEnd"/>
     </w:p>
     <w:p>
       <w:pPr>
@@ -2954,12 +3429,28 @@
           <w:lang w:val="en-US"/>
         </w:rPr>
       </w:pPr>
-      <w:r>
-        <w:rPr>
-          <w:lang w:val="en-US"/>
-        </w:rPr>
-        <w:t>conda env create -f almos.yaml</w:t>
-      </w:r>
+      <w:proofErr w:type="spellStart"/>
+      <w:r>
+        <w:rPr>
+          <w:lang w:val="en-US"/>
+        </w:rPr>
+        <w:t>conda</w:t>
+      </w:r>
+      <w:proofErr w:type="spellEnd"/>
+      <w:r>
+        <w:rPr>
+          <w:lang w:val="en-US"/>
+        </w:rPr>
+        <w:t xml:space="preserve"> env create -f </w:t>
+      </w:r>
+      <w:proofErr w:type="spellStart"/>
+      <w:r>
+        <w:rPr>
+          <w:lang w:val="en-US"/>
+        </w:rPr>
+        <w:t>almos.yaml</w:t>
+      </w:r>
+      <w:proofErr w:type="spellEnd"/>
     </w:p>
     <w:p>
       <w:pPr>
@@ -2969,18 +3460,28 @@
           <w:lang w:val="en-US"/>
         </w:rPr>
       </w:pPr>
-      <w:r>
-        <w:rPr>
-          <w:lang w:val="en-US"/>
-        </w:rPr>
-        <w:t xml:space="preserve">conda env create -f </w:t>
-      </w:r>
+      <w:proofErr w:type="spellStart"/>
+      <w:r>
+        <w:rPr>
+          <w:lang w:val="en-US"/>
+        </w:rPr>
+        <w:t>conda</w:t>
+      </w:r>
+      <w:proofErr w:type="spellEnd"/>
+      <w:r>
+        <w:rPr>
+          <w:lang w:val="en-US"/>
+        </w:rPr>
+        <w:t xml:space="preserve"> env create -f </w:t>
+      </w:r>
+      <w:proofErr w:type="spellStart"/>
       <w:r>
         <w:rPr>
           <w:lang w:val="en-US"/>
         </w:rPr>
         <w:t>environment_TS_CAMLC.yml</w:t>
       </w:r>
+      <w:proofErr w:type="spellEnd"/>
     </w:p>
     <w:p>
       <w:pPr>
@@ -3037,8 +3538,10 @@
           <w:u w:val="single"/>
           <w:lang w:val="en-US"/>
         </w:rPr>
+        <w:lastRenderedPageBreak/>
         <w:t xml:space="preserve">5.1. </w:t>
       </w:r>
+      <w:proofErr w:type="spellStart"/>
       <w:r>
         <w:rPr>
           <w:u w:val="single"/>
@@ -3051,7 +3554,15 @@
           <w:u w:val="single"/>
           <w:lang w:val="en-US"/>
         </w:rPr>
-        <w:t>heminf environment</w:t>
+        <w:t>heminf</w:t>
+      </w:r>
+      <w:proofErr w:type="spellEnd"/>
+      <w:r>
+        <w:rPr>
+          <w:u w:val="single"/>
+          <w:lang w:val="en-US"/>
+        </w:rPr>
+        <w:t xml:space="preserve"> environment</w:t>
       </w:r>
     </w:p>
     <w:p>
@@ -3099,6 +3610,7 @@
         </w:rPr>
         <w:t>“</w:t>
       </w:r>
+      <w:proofErr w:type="spellStart"/>
       <w:r>
         <w:rPr>
           <w:lang w:val="en-US"/>
@@ -3109,7 +3621,14 @@
         <w:rPr>
           <w:lang w:val="en-US"/>
         </w:rPr>
-        <w:t xml:space="preserve">course_setup.ipynb” </w:t>
+        <w:t>course_setup.ipynb</w:t>
+      </w:r>
+      <w:proofErr w:type="spellEnd"/>
+      <w:r>
+        <w:rPr>
+          <w:lang w:val="en-US"/>
+        </w:rPr>
+        <w:t xml:space="preserve">” </w:t>
       </w:r>
       <w:r>
         <w:rPr>
@@ -3131,20 +3650,38 @@
         </w:rPr>
         <w:t xml:space="preserve"> (in the “</w:t>
       </w:r>
-      <w:r>
-        <w:rPr>
-          <w:szCs w:val="24"/>
-          <w:lang w:val="en-US"/>
-        </w:rPr>
-        <w:t>ML_course/</w:t>
-      </w:r>
-      <w:r>
-        <w:rPr>
-          <w:szCs w:val="24"/>
-          <w:lang w:val="en-US"/>
-        </w:rPr>
-        <w:t>Prerequisites/Setup_and_testing</w:t>
-      </w:r>
+      <w:proofErr w:type="spellStart"/>
+      <w:r>
+        <w:rPr>
+          <w:szCs w:val="24"/>
+          <w:lang w:val="en-US"/>
+        </w:rPr>
+        <w:t>ML_course</w:t>
+      </w:r>
+      <w:proofErr w:type="spellEnd"/>
+      <w:r>
+        <w:rPr>
+          <w:szCs w:val="24"/>
+          <w:lang w:val="en-US"/>
+        </w:rPr>
+        <w:t>/</w:t>
+      </w:r>
+      <w:r>
+        <w:rPr>
+          <w:szCs w:val="24"/>
+          <w:lang w:val="en-US"/>
+        </w:rPr>
+        <w:t>Prerequisites/</w:t>
+      </w:r>
+      <w:proofErr w:type="spellStart"/>
+      <w:r>
+        <w:rPr>
+          <w:szCs w:val="24"/>
+          <w:lang w:val="en-US"/>
+        </w:rPr>
+        <w:t>Setup_and_testing</w:t>
+      </w:r>
+      <w:proofErr w:type="spellEnd"/>
       <w:r>
         <w:rPr>
           <w:szCs w:val="24"/>
@@ -3179,7 +3716,29 @@
           <w:szCs w:val="24"/>
           <w:lang w:val="en-US"/>
         </w:rPr>
-        <w:t>* (.ipynb means Interactive Python Notebook)</w:t>
+        <w:t>* (.</w:t>
+      </w:r>
+      <w:proofErr w:type="spellStart"/>
+      <w:r>
+        <w:rPr>
+          <w:i/>
+          <w:iCs/>
+          <w:sz w:val="24"/>
+          <w:szCs w:val="24"/>
+          <w:lang w:val="en-US"/>
+        </w:rPr>
+        <w:t>ipynb</w:t>
+      </w:r>
+      <w:proofErr w:type="spellEnd"/>
+      <w:r>
+        <w:rPr>
+          <w:i/>
+          <w:iCs/>
+          <w:sz w:val="24"/>
+          <w:szCs w:val="24"/>
+          <w:lang w:val="en-US"/>
+        </w:rPr>
+        <w:t xml:space="preserve"> means Interactive Python Notebook)</w:t>
       </w:r>
     </w:p>
     <w:p>
@@ -3199,7 +3758,6 @@
           <w:u w:val="single"/>
           <w:lang w:val="en-US"/>
         </w:rPr>
-        <w:lastRenderedPageBreak/>
         <w:t>VERY IMPORTANT!</w:t>
       </w:r>
       <w:r>
@@ -3475,12 +4033,14 @@
         </w:rPr>
         <w:t>“</w:t>
       </w:r>
+      <w:proofErr w:type="spellStart"/>
       <w:r>
         <w:rPr>
           <w:lang w:val="en-US"/>
         </w:rPr>
         <w:t>cheminf</w:t>
       </w:r>
+      <w:proofErr w:type="spellEnd"/>
       <w:r>
         <w:rPr>
           <w:lang w:val="en-US"/>
@@ -3518,7 +4078,21 @@
         <w:rPr>
           <w:lang w:val="en-US"/>
         </w:rPr>
-        <w:t xml:space="preserve">ake sure that you see the “cheminf” </w:t>
+        <w:t>ake sure that you see the “</w:t>
+      </w:r>
+      <w:proofErr w:type="spellStart"/>
+      <w:r>
+        <w:rPr>
+          <w:lang w:val="en-US"/>
+        </w:rPr>
+        <w:t>cheminf</w:t>
+      </w:r>
+      <w:proofErr w:type="spellEnd"/>
+      <w:r>
+        <w:rPr>
+          <w:lang w:val="en-US"/>
+        </w:rPr>
+        <w:t xml:space="preserve">” </w:t>
       </w:r>
       <w:r>
         <w:rPr>
@@ -3612,6 +4186,57 @@
     </w:p>
     <w:p>
       <w:pPr>
+        <w:rPr>
+          <w:sz w:val="24"/>
+          <w:szCs w:val="24"/>
+          <w:lang w:val="en-US"/>
+        </w:rPr>
+      </w:pPr>
+      <w:r>
+        <w:rPr>
+          <w:b/>
+          <w:bCs/>
+          <w:color w:val="C00000"/>
+          <w:lang w:val="en-US" w:eastAsia="es-ES"/>
+        </w:rPr>
+        <w:t>VERY IMPORTANT</w:t>
+      </w:r>
+      <w:r>
+        <w:rPr>
+          <w:b/>
+          <w:bCs/>
+          <w:color w:val="C00000"/>
+          <w:lang w:val="en-US" w:eastAsia="es-ES"/>
+        </w:rPr>
+        <w:t xml:space="preserve"> 2</w:t>
+      </w:r>
+      <w:r>
+        <w:rPr>
+          <w:b/>
+          <w:bCs/>
+          <w:color w:val="C00000"/>
+          <w:lang w:val="en-US" w:eastAsia="es-ES"/>
+        </w:rPr>
+        <w:t>!</w:t>
+      </w:r>
+      <w:r>
+        <w:rPr>
+          <w:sz w:val="24"/>
+          <w:szCs w:val="24"/>
+          <w:lang w:val="en-US"/>
+        </w:rPr>
+        <w:t xml:space="preserve"> </w:t>
+      </w:r>
+      <w:r>
+        <w:rPr>
+          <w:sz w:val="24"/>
+          <w:szCs w:val="24"/>
+        </w:rPr>
+        <w:t>If you still do not see the Jupyter kernel, look for a blue button in the bottom-left part of the interface asking you to enable “Python,” “Kernels,” or “Jupyter Notebook.”</w:t>
+      </w:r>
+    </w:p>
+    <w:p>
+      <w:pPr>
         <w:jc w:val="both"/>
         <w:rPr>
           <w:lang w:val="en-US"/>
@@ -3632,7 +4257,6 @@
         <w:rPr>
           <w:lang w:val="en-US"/>
         </w:rPr>
-        <w:lastRenderedPageBreak/>
         <w:t>5.</w:t>
       </w:r>
       <w:r>
@@ -3914,7 +4538,25 @@
           <w:szCs w:val="24"/>
           <w:lang w:val="en-US"/>
         </w:rPr>
-        <w:t xml:space="preserve">the “CHEMINF_course_setup.ipynb” Jupyter Notebook and, then, close </w:t>
+        <w:t>the “</w:t>
+      </w:r>
+      <w:proofErr w:type="spellStart"/>
+      <w:r>
+        <w:rPr>
+          <w:sz w:val="24"/>
+          <w:szCs w:val="24"/>
+          <w:lang w:val="en-US"/>
+        </w:rPr>
+        <w:t>CHEMINF_course_setup.ipynb</w:t>
+      </w:r>
+      <w:proofErr w:type="spellEnd"/>
+      <w:r>
+        <w:rPr>
+          <w:sz w:val="24"/>
+          <w:szCs w:val="24"/>
+          <w:lang w:val="en-US"/>
+        </w:rPr>
+        <w:t xml:space="preserve">” Jupyter Notebook and, then, close </w:t>
       </w:r>
       <w:r>
         <w:rPr>
@@ -3951,6 +4593,7 @@
         </w:rPr>
         <w:t xml:space="preserve">5.2. </w:t>
       </w:r>
+      <w:proofErr w:type="spellStart"/>
       <w:r>
         <w:rPr>
           <w:u w:val="single"/>
@@ -3958,6 +4601,7 @@
         </w:rPr>
         <w:t>almos</w:t>
       </w:r>
+      <w:proofErr w:type="spellEnd"/>
       <w:r>
         <w:rPr>
           <w:u w:val="single"/>
@@ -4010,6 +4654,7 @@
         </w:rPr>
         <w:t>Open, using VSC, the “</w:t>
       </w:r>
+      <w:proofErr w:type="spellStart"/>
       <w:r>
         <w:rPr>
           <w:lang w:val="en-US"/>
@@ -4020,7 +4665,14 @@
         <w:rPr>
           <w:lang w:val="en-US"/>
         </w:rPr>
-        <w:t>course_setup.ipynb” Jupyter Notebook unzipped from the previous step</w:t>
+        <w:t>course_setup.ipynb</w:t>
+      </w:r>
+      <w:proofErr w:type="spellEnd"/>
+      <w:r>
+        <w:rPr>
+          <w:lang w:val="en-US"/>
+        </w:rPr>
+        <w:t>” Jupyter Notebook unzipped from the previous step</w:t>
       </w:r>
       <w:r>
         <w:rPr>
@@ -4028,12 +4680,14 @@
         </w:rPr>
         <w:t xml:space="preserve"> (in the “</w:t>
       </w:r>
+      <w:proofErr w:type="spellStart"/>
       <w:r>
         <w:rPr>
           <w:lang w:val="en-US"/>
         </w:rPr>
         <w:t>ML_course</w:t>
       </w:r>
+      <w:proofErr w:type="spellEnd"/>
       <w:r>
         <w:rPr>
           <w:lang w:val="en-US"/>
@@ -4052,12 +4706,14 @@
         </w:rPr>
         <w:t>/</w:t>
       </w:r>
+      <w:proofErr w:type="spellStart"/>
       <w:r>
         <w:rPr>
           <w:lang w:val="en-US"/>
         </w:rPr>
         <w:t>Setup_and_testing</w:t>
       </w:r>
+      <w:proofErr w:type="spellEnd"/>
       <w:r>
         <w:rPr>
           <w:lang w:val="en-US"/>
@@ -4103,12 +4759,14 @@
         </w:rPr>
         <w:t xml:space="preserve">When VSC opens, select the </w:t>
       </w:r>
+      <w:proofErr w:type="spellStart"/>
       <w:r>
         <w:rPr>
           <w:lang w:val="en-US"/>
         </w:rPr>
         <w:t>almos</w:t>
       </w:r>
+      <w:proofErr w:type="spellEnd"/>
       <w:r>
         <w:rPr>
           <w:lang w:val="en-US"/>
@@ -4139,12 +4797,14 @@
         </w:rPr>
         <w:t>“</w:t>
       </w:r>
+      <w:proofErr w:type="spellStart"/>
       <w:r>
         <w:rPr>
           <w:lang w:val="en-US"/>
         </w:rPr>
         <w:t>almos</w:t>
       </w:r>
+      <w:proofErr w:type="spellEnd"/>
       <w:r>
         <w:rPr>
           <w:lang w:val="en-US"/>
@@ -4401,6 +5061,7 @@
         </w:rPr>
         <w:t>5. Close the “</w:t>
       </w:r>
+      <w:proofErr w:type="spellStart"/>
       <w:r>
         <w:rPr>
           <w:lang w:val="en-US"/>
@@ -4413,7 +5074,16 @@
           <w:szCs w:val="24"/>
           <w:lang w:val="en-US"/>
         </w:rPr>
-        <w:t>_course_setup.ipynb” Jupyter Notebook and, then, close VSC.</w:t>
+        <w:t>_course_setup.ipynb</w:t>
+      </w:r>
+      <w:proofErr w:type="spellEnd"/>
+      <w:r>
+        <w:rPr>
+          <w:sz w:val="24"/>
+          <w:szCs w:val="24"/>
+          <w:lang w:val="en-US"/>
+        </w:rPr>
+        <w:t>” Jupyter Notebook and, then, close VSC.</w:t>
       </w:r>
     </w:p>
     <w:p>
@@ -4443,12 +5113,14 @@
         <w:lastRenderedPageBreak/>
         <w:t xml:space="preserve">5.3. </w:t>
       </w:r>
+      <w:proofErr w:type="spellStart"/>
       <w:r>
         <w:rPr>
           <w:lang w:val="en-US"/>
         </w:rPr>
         <w:t>bayesian_ts</w:t>
       </w:r>
+      <w:proofErr w:type="spellEnd"/>
       <w:r>
         <w:rPr>
           <w:u w:val="single"/>
@@ -4484,6 +5156,7 @@
         </w:rPr>
         <w:t>Open, using VSC, the “</w:t>
       </w:r>
+      <w:proofErr w:type="spellStart"/>
       <w:r>
         <w:rPr>
           <w:szCs w:val="24"/>
@@ -4495,7 +5168,14 @@
         <w:rPr>
           <w:lang w:val="en-US"/>
         </w:rPr>
-        <w:t>.ipynb” Jupyter Notebook unzipped from the previous step</w:t>
+        <w:t>.ipynb</w:t>
+      </w:r>
+      <w:proofErr w:type="spellEnd"/>
+      <w:r>
+        <w:rPr>
+          <w:lang w:val="en-US"/>
+        </w:rPr>
+        <w:t>” Jupyter Notebook unzipped from the previous step</w:t>
       </w:r>
       <w:r>
         <w:rPr>
@@ -4503,12 +5183,14 @@
         </w:rPr>
         <w:t xml:space="preserve"> (in the “</w:t>
       </w:r>
+      <w:proofErr w:type="spellStart"/>
       <w:r>
         <w:rPr>
           <w:lang w:val="en-US"/>
         </w:rPr>
         <w:t>ML_course</w:t>
       </w:r>
+      <w:proofErr w:type="spellEnd"/>
       <w:r>
         <w:rPr>
           <w:lang w:val="en-US"/>
@@ -4527,12 +5209,14 @@
         </w:rPr>
         <w:t>/</w:t>
       </w:r>
+      <w:proofErr w:type="spellStart"/>
       <w:r>
         <w:rPr>
           <w:lang w:val="en-US"/>
         </w:rPr>
         <w:t>Setup_and_testing</w:t>
       </w:r>
+      <w:proofErr w:type="spellEnd"/>
       <w:r>
         <w:rPr>
           <w:lang w:val="en-US"/>
@@ -4578,12 +5262,14 @@
         </w:rPr>
         <w:t xml:space="preserve">When VSC opens, select the </w:t>
       </w:r>
+      <w:proofErr w:type="spellStart"/>
       <w:r>
         <w:rPr>
           <w:lang w:val="en-US"/>
         </w:rPr>
         <w:t>bayesian_ts</w:t>
       </w:r>
+      <w:proofErr w:type="spellEnd"/>
       <w:r>
         <w:rPr>
           <w:lang w:val="en-US"/>
@@ -4594,7 +5280,21 @@
         <w:rPr>
           <w:lang w:val="en-US"/>
         </w:rPr>
-        <w:t xml:space="preserve"> (see step 5.1.2, but this time with “bayesian_ts”)</w:t>
+        <w:t xml:space="preserve"> (see step 5.1.2, but this time with “</w:t>
+      </w:r>
+      <w:proofErr w:type="spellStart"/>
+      <w:r>
+        <w:rPr>
+          <w:lang w:val="en-US"/>
+        </w:rPr>
+        <w:t>bayesian_ts</w:t>
+      </w:r>
+      <w:proofErr w:type="spellEnd"/>
+      <w:r>
+        <w:rPr>
+          <w:lang w:val="en-US"/>
+        </w:rPr>
+        <w:t>”)</w:t>
       </w:r>
     </w:p>
     <w:p>
@@ -4834,6 +5534,7 @@
         </w:rPr>
         <w:t>5. Close the “</w:t>
       </w:r>
+      <w:proofErr w:type="spellStart"/>
       <w:r>
         <w:rPr>
           <w:sz w:val="24"/>
@@ -4848,7 +5549,16 @@
           <w:szCs w:val="24"/>
           <w:lang w:val="en-US"/>
         </w:rPr>
-        <w:t>_setup.ipynb” Jupyter Notebook and, then, close VSC.</w:t>
+        <w:t>_setup.ipynb</w:t>
+      </w:r>
+      <w:proofErr w:type="spellEnd"/>
+      <w:r>
+        <w:rPr>
+          <w:sz w:val="24"/>
+          <w:szCs w:val="24"/>
+          <w:lang w:val="en-US"/>
+        </w:rPr>
+        <w:t>” Jupyter Notebook and, then, close VSC.</w:t>
       </w:r>
     </w:p>
     <w:p>
@@ -4973,6 +5683,7 @@
         </w:rPr>
         <w:t>the “</w:t>
       </w:r>
+      <w:proofErr w:type="spellStart"/>
       <w:r>
         <w:rPr>
           <w:rFonts w:cs="Courier New"/>
@@ -4982,6 +5693,7 @@
         </w:rPr>
         <w:t>Setup_and_testing</w:t>
       </w:r>
+      <w:proofErr w:type="spellEnd"/>
       <w:r>
         <w:rPr>
           <w:rFonts w:cs="Courier New"/>
@@ -5125,8 +5837,16 @@
         <w:rPr>
           <w:lang w:val="en-US"/>
         </w:rPr>
-        <w:t>7. Testing easyROB</w:t>
-      </w:r>
+        <w:t xml:space="preserve">7. Testing </w:t>
+      </w:r>
+      <w:proofErr w:type="spellStart"/>
+      <w:r>
+        <w:rPr>
+          <w:lang w:val="en-US"/>
+        </w:rPr>
+        <w:t>easyROB</w:t>
+      </w:r>
+      <w:proofErr w:type="spellEnd"/>
     </w:p>
     <w:p>
       <w:pPr>
@@ -5149,11 +5869,19 @@
         </w:rPr>
         <w:t xml:space="preserve"> </w:t>
       </w:r>
-      <w:r>
-        <w:rPr>
-          <w:lang w:val="en-US"/>
-        </w:rPr>
-        <w:t>easyROB executable</w:t>
+      <w:proofErr w:type="spellStart"/>
+      <w:r>
+        <w:rPr>
+          <w:lang w:val="en-US"/>
+        </w:rPr>
+        <w:t>easyROB</w:t>
+      </w:r>
+      <w:proofErr w:type="spellEnd"/>
+      <w:r>
+        <w:rPr>
+          <w:lang w:val="en-US"/>
+        </w:rPr>
+        <w:t xml:space="preserve"> executable</w:t>
       </w:r>
       <w:r>
         <w:rPr>
@@ -5240,19 +5968,7 @@
         <w:rPr>
           <w:lang w:val="en-US"/>
         </w:rPr>
-        <w:t>7.</w:t>
-      </w:r>
-      <w:r>
-        <w:rPr>
-          <w:lang w:val="en-US"/>
-        </w:rPr>
-        <w:t>2</w:t>
-      </w:r>
-      <w:r>
-        <w:rPr>
-          <w:lang w:val="en-US"/>
-        </w:rPr>
-        <w:t>.</w:t>
+        <w:t>7.2.</w:t>
       </w:r>
       <w:r>
         <w:rPr>
@@ -5343,7 +6059,21 @@
         <w:rPr>
           <w:lang w:val="en-US"/>
         </w:rPr>
-        <w:t xml:space="preserve"> easyROB from </w:t>
+        <w:t xml:space="preserve"> </w:t>
+      </w:r>
+      <w:proofErr w:type="spellStart"/>
+      <w:r>
+        <w:rPr>
+          <w:lang w:val="en-US"/>
+        </w:rPr>
+        <w:t>easyROB</w:t>
+      </w:r>
+      <w:proofErr w:type="spellEnd"/>
+      <w:r>
+        <w:rPr>
+          <w:lang w:val="en-US"/>
+        </w:rPr>
+        <w:t xml:space="preserve"> from </w:t>
       </w:r>
       <w:r>
         <w:rPr>
@@ -5375,7 +6105,21 @@
         <w:rPr>
           <w:lang w:val="en-US"/>
         </w:rPr>
-        <w:t>This method runs easyROB using a standard ROBERT installation (non-portable).</w:t>
+        <w:t xml:space="preserve">This method runs </w:t>
+      </w:r>
+      <w:proofErr w:type="spellStart"/>
+      <w:r>
+        <w:rPr>
+          <w:lang w:val="en-US"/>
+        </w:rPr>
+        <w:t>easyROB</w:t>
+      </w:r>
+      <w:proofErr w:type="spellEnd"/>
+      <w:r>
+        <w:rPr>
+          <w:lang w:val="en-US"/>
+        </w:rPr>
+        <w:t xml:space="preserve"> using a standard ROBERT installation (non-portable).</w:t>
       </w:r>
     </w:p>
     <w:p>
@@ -5476,7 +6220,21 @@
         <w:rPr>
           <w:lang w:val="en-US"/>
         </w:rPr>
-        <w:t>Activate the conda environment where ROBERT is installed:</w:t>
+        <w:t xml:space="preserve">Activate the </w:t>
+      </w:r>
+      <w:proofErr w:type="spellStart"/>
+      <w:r>
+        <w:rPr>
+          <w:lang w:val="en-US"/>
+        </w:rPr>
+        <w:t>conda</w:t>
+      </w:r>
+      <w:proofErr w:type="spellEnd"/>
+      <w:r>
+        <w:rPr>
+          <w:lang w:val="en-US"/>
+        </w:rPr>
+        <w:t xml:space="preserve"> environment where ROBERT is installed:</w:t>
       </w:r>
     </w:p>
     <w:p>
@@ -5499,22 +6257,34 @@
           <w:lang w:val="en-US"/>
         </w:rPr>
       </w:pPr>
+      <w:proofErr w:type="spellStart"/>
       <w:r>
         <w:rPr>
           <w:rFonts w:ascii="Courier New" w:eastAsia="Courier New" w:hAnsi="Courier New"/>
           <w:sz w:val="20"/>
           <w:lang w:val="en-US"/>
         </w:rPr>
-        <w:t xml:space="preserve">conda activate </w:t>
-      </w:r>
+        <w:t>conda</w:t>
+      </w:r>
+      <w:proofErr w:type="spellEnd"/>
       <w:r>
         <w:rPr>
           <w:rFonts w:ascii="Courier New" w:eastAsia="Courier New" w:hAnsi="Courier New"/>
           <w:sz w:val="20"/>
           <w:lang w:val="en-US"/>
         </w:rPr>
+        <w:t xml:space="preserve"> activate </w:t>
+      </w:r>
+      <w:proofErr w:type="spellStart"/>
+      <w:r>
+        <w:rPr>
+          <w:rFonts w:ascii="Courier New" w:eastAsia="Courier New" w:hAnsi="Courier New"/>
+          <w:sz w:val="20"/>
+          <w:lang w:val="en-US"/>
+        </w:rPr>
         <w:t>cheminf</w:t>
       </w:r>
+      <w:proofErr w:type="spellEnd"/>
     </w:p>
     <w:p>
       <w:pPr>
@@ -5545,8 +6315,16 @@
         <w:rPr>
           <w:lang w:val="en-US"/>
         </w:rPr>
-        <w:t>Run easyrob</w:t>
-      </w:r>
+        <w:t xml:space="preserve">Run </w:t>
+      </w:r>
+      <w:proofErr w:type="spellStart"/>
+      <w:r>
+        <w:rPr>
+          <w:lang w:val="en-US"/>
+        </w:rPr>
+        <w:t>easyrob</w:t>
+      </w:r>
+      <w:proofErr w:type="spellEnd"/>
       <w:r>
         <w:rPr>
           <w:lang w:val="en-US"/>
@@ -5574,6 +6352,7 @@
           <w:lang w:val="en-US"/>
         </w:rPr>
       </w:pPr>
+      <w:proofErr w:type="spellStart"/>
       <w:r>
         <w:rPr>
           <w:rFonts w:ascii="Courier New" w:eastAsia="Courier New" w:hAnsi="Courier New"/>
@@ -5582,6 +6361,7 @@
         </w:rPr>
         <w:t>easyrob</w:t>
       </w:r>
+      <w:proofErr w:type="spellEnd"/>
     </w:p>
     <w:p>
       <w:pPr>

</xml_diff>